<commit_message>
Privacy policy page + hand-off copy
Co-Authored-By: Claude Opus 5 <noreply@anthropic.com>
</commit_message>
<xml_diff>
--- a/handoff/PLAY-STORE-GUIDE.docx
+++ b/handoff/PLAY-STORE-GUIDE.docx
@@ -814,7 +814,7 @@
         <w:t xml:space="preserve">Privacy policy URL</w:t>
       </w:r>
       <w:r>
-        <w:t xml:space="preserve">: required. Host a simple page (e.g. </w:t>
+        <w:t xml:space="preserve">: required. Already published: </w:t>
       </w:r>
       <w:r>
         <w:rPr>
@@ -825,7 +825,29 @@
         <w:t xml:space="preserve">https://rash914.github.io/Calorie/privacy.html</w:t>
       </w:r>
       <w:r>
-        <w:t xml:space="preserve">) saying the above.</w:t>
+        <w:t xml:space="preserve"> (text in </w:t>
+      </w:r>
+      <w:r>
+        <w:rPr>
+          <w:rFonts w:ascii="Consolas" w:cs="Consolas" w:eastAsia="Consolas" w:hAnsi="Consolas"/>
+          <w:sz w:val="18"/>
+          <w:szCs w:val="18"/>
+        </w:rPr>
+        <w:t xml:space="preserve">PRIVACY-POLICY.md</w:t>
+      </w:r>
+      <w:r>
+        <w:t xml:space="preserve">; source </w:t>
+      </w:r>
+      <w:r>
+        <w:rPr>
+          <w:rFonts w:ascii="Consolas" w:cs="Consolas" w:eastAsia="Consolas" w:hAnsi="Consolas"/>
+          <w:sz w:val="18"/>
+          <w:szCs w:val="18"/>
+        </w:rPr>
+        <w:t xml:space="preserve">app/privacy.html</w:t>
+      </w:r>
+      <w:r>
+        <w:t xml:space="preserve">).</w:t>
       </w:r>
     </w:p>
     <w:p>

</xml_diff>